<commit_message>
Cập nhật đề cương DATN - Đỗ Thành Long 5250089
Co-Authored-By: Claude Opus 5 <noreply@anthropic.com>
</commit_message>
<xml_diff>
--- a/Đề cương DATN - Đỗ Thành Long 5250089.docx
+++ b/Đề cương DATN - Đỗ Thành Long 5250089.docx
@@ -307,8 +307,10 @@
       <w:pPr>
         <w:jc w:val="right"/>
         <w:rPr>
+          <w:rFonts w:hint="default"/>
           <w:i w:val="0"/>
           <w:vertAlign w:val="baseline"/>
+          <w:lang w:val="en-US"/>
         </w:rPr>
       </w:pPr>
       <w:r>
@@ -317,7 +319,55 @@
           <w:vertAlign w:val="baseline"/>
           <w:rtl w:val="0"/>
         </w:rPr>
-        <w:t>Hà Nội, ngày    tháng    năm 202..</w:t>
+        <w:t xml:space="preserve">Hà Nội, ngày </w:t>
+      </w:r>
+      <w:r>
+        <w:rPr>
+          <w:rFonts w:hint="default"/>
+          <w:i/>
+          <w:vertAlign w:val="baseline"/>
+          <w:rtl w:val="0"/>
+          <w:lang w:val="en-US"/>
+        </w:rPr>
+        <w:t>15</w:t>
+      </w:r>
+      <w:bookmarkStart w:id="0" w:name="_GoBack"/>
+      <w:bookmarkEnd w:id="0"/>
+      <w:r>
+        <w:rPr>
+          <w:i/>
+          <w:vertAlign w:val="baseline"/>
+          <w:rtl w:val="0"/>
+        </w:rPr>
+        <w:t xml:space="preserve"> tháng </w:t>
+      </w:r>
+      <w:r>
+        <w:rPr>
+          <w:rFonts w:hint="default"/>
+          <w:i/>
+          <w:vertAlign w:val="baseline"/>
+          <w:rtl w:val="0"/>
+          <w:lang w:val="en-US"/>
+        </w:rPr>
+        <w:t>09</w:t>
+      </w:r>
+      <w:r>
+        <w:rPr>
+          <w:i/>
+          <w:vertAlign w:val="baseline"/>
+          <w:rtl w:val="0"/>
+        </w:rPr>
+        <w:t xml:space="preserve"> năm 202</w:t>
+      </w:r>
+      <w:r>
+        <w:rPr>
+          <w:rFonts w:hint="default"/>
+          <w:i/>
+          <w:vertAlign w:val="baseline"/>
+          <w:rtl w:val="0"/>
+          <w:lang w:val="en-US"/>
+        </w:rPr>
+        <w:t>6</w:t>
       </w:r>
     </w:p>
     <w:p>
@@ -456,8 +506,6 @@
         </w:rPr>
         <w:t>0966241813</w:t>
       </w:r>
-      <w:bookmarkStart w:id="0" w:name="_GoBack"/>
-      <w:bookmarkEnd w:id="0"/>
       <w:r>
         <w:rPr>
           <w:rFonts w:eastAsia="Times New Roman" w:cs="Times New Roman"/>
@@ -7610,8 +7658,8 @@
     <w:lsdException w:qFormat="1" w:unhideWhenUsed="0" w:uiPriority="0" w:semiHidden="0" w:name="heading 1"/>
     <w:lsdException w:qFormat="1" w:unhideWhenUsed="0" w:uiPriority="0" w:semiHidden="0" w:name="heading 2"/>
     <w:lsdException w:qFormat="1" w:unhideWhenUsed="0" w:uiPriority="0" w:semiHidden="0" w:name="heading 3"/>
-    <w:lsdException w:unhideWhenUsed="0" w:uiPriority="0" w:semiHidden="0" w:name="heading 4"/>
-    <w:lsdException w:unhideWhenUsed="0" w:uiPriority="0" w:semiHidden="0" w:name="heading 5"/>
+    <w:lsdException w:qFormat="1" w:unhideWhenUsed="0" w:uiPriority="0" w:semiHidden="0" w:name="heading 4"/>
+    <w:lsdException w:qFormat="1" w:unhideWhenUsed="0" w:uiPriority="0" w:semiHidden="0" w:name="heading 5"/>
     <w:lsdException w:qFormat="1" w:unhideWhenUsed="0" w:uiPriority="0" w:semiHidden="0" w:name="heading 6"/>
     <w:lsdException w:qFormat="1" w:uiPriority="0" w:name="heading 7"/>
     <w:lsdException w:qFormat="1" w:uiPriority="0" w:name="heading 8"/>
@@ -7671,7 +7719,7 @@
     <w:lsdException w:qFormat="1" w:unhideWhenUsed="0" w:uiPriority="0" w:semiHidden="0" w:name="Title"/>
     <w:lsdException w:unhideWhenUsed="0" w:uiPriority="0" w:semiHidden="0" w:name="Closing"/>
     <w:lsdException w:unhideWhenUsed="0" w:uiPriority="0" w:semiHidden="0" w:name="Signature"/>
-    <w:lsdException w:unhideWhenUsed="0" w:uiPriority="0" w:semiHidden="0" w:name="Default Paragraph Font"/>
+    <w:lsdException w:qFormat="1" w:unhideWhenUsed="0" w:uiPriority="0" w:semiHidden="0" w:name="Default Paragraph Font"/>
     <w:lsdException w:unhideWhenUsed="0" w:uiPriority="0" w:semiHidden="0" w:name="Body Text"/>
     <w:lsdException w:unhideWhenUsed="0" w:uiPriority="0" w:semiHidden="0" w:name="Body Text Indent"/>
     <w:lsdException w:unhideWhenUsed="0" w:uiPriority="0" w:semiHidden="0" w:name="List Continue"/>
@@ -7680,7 +7728,7 @@
     <w:lsdException w:unhideWhenUsed="0" w:uiPriority="0" w:semiHidden="0" w:name="List Continue 4"/>
     <w:lsdException w:unhideWhenUsed="0" w:uiPriority="0" w:semiHidden="0" w:name="List Continue 5"/>
     <w:lsdException w:unhideWhenUsed="0" w:uiPriority="0" w:semiHidden="0" w:name="Message Header"/>
-    <w:lsdException w:unhideWhenUsed="0" w:uiPriority="0" w:semiHidden="0" w:name="Subtitle"/>
+    <w:lsdException w:qFormat="1" w:unhideWhenUsed="0" w:uiPriority="0" w:semiHidden="0" w:name="Subtitle"/>
     <w:lsdException w:unhideWhenUsed="0" w:uiPriority="0" w:semiHidden="0" w:name="Salutation"/>
     <w:lsdException w:unhideWhenUsed="0" w:uiPriority="0" w:semiHidden="0" w:name="Date"/>
     <w:lsdException w:unhideWhenUsed="0" w:uiPriority="0" w:semiHidden="0" w:name="Body Text First Indent"/>
@@ -7709,7 +7757,7 @@
     <w:lsdException w:unhideWhenUsed="0" w:uiPriority="0" w:semiHidden="0" w:name="HTML Sample"/>
     <w:lsdException w:unhideWhenUsed="0" w:uiPriority="0" w:semiHidden="0" w:name="HTML Typewriter"/>
     <w:lsdException w:unhideWhenUsed="0" w:uiPriority="0" w:semiHidden="0" w:name="HTML Variable"/>
-    <w:lsdException w:unhideWhenUsed="0" w:uiPriority="0" w:name="Normal Table"/>
+    <w:lsdException w:qFormat="1" w:unhideWhenUsed="0" w:uiPriority="0" w:name="Normal Table"/>
     <w:lsdException w:unhideWhenUsed="0" w:uiPriority="0" w:semiHidden="0" w:name="annotation subject"/>
     <w:lsdException w:unhideWhenUsed="0" w:uiPriority="0" w:semiHidden="0" w:name="Table Simple 1"/>
     <w:lsdException w:unhideWhenUsed="0" w:uiPriority="0" w:semiHidden="0" w:name="Table Simple 2"/>
@@ -7754,7 +7802,7 @@
     <w:lsdException w:unhideWhenUsed="0" w:uiPriority="0" w:semiHidden="0" w:name="Table Web 2"/>
     <w:lsdException w:unhideWhenUsed="0" w:uiPriority="0" w:semiHidden="0" w:name="Table Web 3"/>
     <w:lsdException w:unhideWhenUsed="0" w:uiPriority="0" w:semiHidden="0" w:name="Balloon Text"/>
-    <w:lsdException w:unhideWhenUsed="0" w:uiPriority="0" w:semiHidden="0" w:name="Table Grid"/>
+    <w:lsdException w:qFormat="1" w:unhideWhenUsed="0" w:uiPriority="0" w:semiHidden="0" w:name="Table Grid"/>
     <w:lsdException w:unhideWhenUsed="0" w:uiPriority="0" w:semiHidden="0" w:name="Table Theme"/>
     <w:lsdException w:unhideWhenUsed="0" w:uiPriority="60" w:semiHidden="0" w:name="Light Shading"/>
     <w:lsdException w:unhideWhenUsed="0" w:uiPriority="61" w:semiHidden="0" w:name="Light List"/>
@@ -7776,7 +7824,7 @@
     <w:lsdException w:unhideWhenUsed="0" w:uiPriority="63" w:semiHidden="0" w:name="Medium Shading 1 Accent 1"/>
     <w:lsdException w:unhideWhenUsed="0" w:uiPriority="64" w:semiHidden="0" w:name="Medium Shading 2 Accent 1"/>
     <w:lsdException w:unhideWhenUsed="0" w:uiPriority="65" w:semiHidden="0" w:name="Medium List 1 Accent 1"/>
-    <w:lsdException w:unhideWhenUsed="0" w:uiPriority="0" w:semiHidden="0" w:name="List Paragraph"/>
+    <w:lsdException w:qFormat="1" w:unhideWhenUsed="0" w:uiPriority="0" w:semiHidden="0" w:name="List Paragraph"/>
     <w:lsdException w:unhideWhenUsed="0" w:uiPriority="66" w:semiHidden="0" w:name="Medium List 2 Accent 1"/>
     <w:lsdException w:unhideWhenUsed="0" w:uiPriority="67" w:semiHidden="0" w:name="Medium Grid 1 Accent 1"/>
     <w:lsdException w:unhideWhenUsed="0" w:uiPriority="68" w:semiHidden="0" w:name="Medium Grid 2 Accent 1"/>
@@ -7952,6 +8000,7 @@
     <w:name w:val="heading 4"/>
     <w:basedOn w:val="1"/>
     <w:next w:val="1"/>
+    <w:qFormat/>
     <w:uiPriority w:val="0"/>
     <w:pPr>
       <w:keepNext/>
@@ -7969,6 +8018,7 @@
     <w:name w:val="heading 5"/>
     <w:basedOn w:val="1"/>
     <w:next w:val="1"/>
+    <w:qFormat/>
     <w:uiPriority w:val="0"/>
     <w:pPr>
       <w:keepNext/>
@@ -8002,6 +8052,7 @@
   </w:style>
   <w:style w:type="character" w:default="1" w:styleId="8">
     <w:name w:val="Default Paragraph Font"/>
+    <w:qFormat/>
     <w:uiPriority w:val="0"/>
     <w:rPr>
       <w:w w:val="100"/>
@@ -8013,6 +8064,7 @@
   <w:style w:type="table" w:default="1" w:styleId="9">
     <w:name w:val="Normal Table"/>
     <w:semiHidden/>
+    <w:qFormat/>
     <w:uiPriority w:val="0"/>
     <w:tblPr>
       <w:tblCellMar>
@@ -8027,6 +8079,7 @@
     <w:name w:val="Subtitle"/>
     <w:basedOn w:val="1"/>
     <w:next w:val="1"/>
+    <w:qFormat/>
     <w:uiPriority w:val="0"/>
     <w:pPr>
       <w:keepNext/>
@@ -8045,6 +8098,7 @@
   <w:style w:type="table" w:styleId="11">
     <w:name w:val="Table Grid"/>
     <w:basedOn w:val="12"/>
+    <w:qFormat/>
     <w:uiPriority w:val="0"/>
     <w:pPr>
       <w:suppressAutoHyphens/>
@@ -8121,6 +8175,7 @@
   <w:style w:type="paragraph" w:customStyle="1" w:styleId="15">
     <w:name w:val="Char"/>
     <w:basedOn w:val="1"/>
+    <w:qFormat/>
     <w:uiPriority w:val="0"/>
     <w:pPr>
       <w:suppressAutoHyphens/>
@@ -8143,6 +8198,7 @@
   <w:style w:type="paragraph" w:styleId="16">
     <w:name w:val="List Paragraph"/>
     <w:basedOn w:val="1"/>
+    <w:qFormat/>
     <w:uiPriority w:val="0"/>
     <w:pPr>
       <w:suppressAutoHyphens/>

</xml_diff>